<commit_message>
Submit UW-Madison RISE-AI application, update career search docs
- Finalize Academic Cover Letter and CV for UW-Madison submission
- Mark academic track application log as applied (Sept 9, 2026)
- Update handoff notes and ops track to reflect next task: shift
  primary focus back to arts/nonprofit operations applications
- Note academic search continues in parallel for similar postings

Co-Authored-By: Claude Sonnet 5 <noreply@anthropic.com>
</commit_message>
<xml_diff>
--- a/Academic CV - UW Madison.docx
+++ b/Academic CV - UW Madison.docx
@@ -11,6 +11,10 @@
         <w:t>﻿</w:t>
       </w:r>
       <w:r>
+        <w:rPr>
+          <w:sz w:val="40"/>
+          <w:szCs w:val="40"/>
+        </w:rPr>
         <w:t>Maxwell Perkins</w:t>
       </w:r>
     </w:p>
@@ -18,19 +22,62 @@
       <w:pPr>
         <w:spacing w:after="80"/>
         <w:jc w:val="center"/>
-      </w:pPr>
-      <w:r>
-        <w:t>Brooklyn, NY | maxwellhperkins@gmail.com | 925-259-1748</w:t>
+        <w:rPr>
+          <w:sz w:val="28"/>
+          <w:szCs w:val="28"/>
+        </w:rPr>
+      </w:pPr>
+      <w:r>
+        <w:rPr>
+          <w:sz w:val="28"/>
+          <w:szCs w:val="28"/>
+        </w:rPr>
+        <w:t>maxwellhperkins@gmail.com | 925-259-1748</w:t>
       </w:r>
     </w:p>
     <w:p>
       <w:pPr>
         <w:spacing w:after="80"/>
         <w:jc w:val="center"/>
-      </w:pPr>
-      <w:r>
-        <w:t>Portfolio: https://ai-portfolio-landing-page.vercel.app/ | LinkedIn: linkedin.com/in/maxwell-perkins-702a82207</w:t>
-      </w:r>
+        <w:rPr>
+          <w:sz w:val="32"/>
+          <w:szCs w:val="32"/>
+        </w:rPr>
+      </w:pPr>
+      <w:hyperlink r:id="rId6" w:history="1">
+        <w:r>
+          <w:rPr>
+            <w:rStyle w:val="Hyperlink"/>
+            <w:sz w:val="32"/>
+            <w:szCs w:val="32"/>
+          </w:rPr>
+          <w:t>Portfolio</w:t>
+        </w:r>
+      </w:hyperlink>
+      <w:r>
+        <w:rPr>
+          <w:sz w:val="32"/>
+          <w:szCs w:val="32"/>
+        </w:rPr>
+        <w:t xml:space="preserve"> </w:t>
+      </w:r>
+      <w:r>
+        <w:rPr>
+          <w:sz w:val="32"/>
+          <w:szCs w:val="32"/>
+        </w:rPr>
+        <w:t xml:space="preserve">| </w:t>
+      </w:r>
+      <w:hyperlink r:id="rId7" w:history="1">
+        <w:r>
+          <w:rPr>
+            <w:rStyle w:val="Hyperlink"/>
+            <w:sz w:val="32"/>
+            <w:szCs w:val="32"/>
+          </w:rPr>
+          <w:t>LinkedIn</w:t>
+        </w:r>
+      </w:hyperlink>
     </w:p>
     <w:p>
       <w:pPr>
@@ -42,15 +89,22 @@
       <w:r>
         <w:rPr>
           <w:b/>
+          <w:sz w:val="32"/>
+          <w:szCs w:val="32"/>
+        </w:rPr>
+        <w:t>E</w:t>
+      </w:r>
+      <w:r>
+        <w:rPr>
+          <w:b/>
           <w:sz w:val="26"/>
         </w:rPr>
-        <w:t>EDUCATION</w:t>
+        <w:t>DUCATION</w:t>
       </w:r>
     </w:p>
     <w:p>
       <w:pPr>
         <w:spacing w:after="80"/>
-        <w:jc w:val="center"/>
       </w:pPr>
       <w:r>
         <w:rPr>
@@ -62,22 +116,32 @@
         <w:rPr>
           <w:b/>
         </w:rPr>
-        <w:t>Song</w:t>
+        <w:t>Music Theory and Composition</w:t>
       </w:r>
       <w:r>
         <w:rPr>
           <w:b/>
         </w:rPr>
-        <w:t>writing</w:t>
-      </w:r>
-      <w:r>
-        <w:t xml:space="preserve"> — New York University, 2022</w:t>
+        <w:t xml:space="preserve"> (Songwriting </w:t>
+      </w:r>
+      <w:proofErr w:type="gramStart"/>
+      <w:r>
+        <w:rPr>
+          <w:b/>
+        </w:rPr>
+        <w:t xml:space="preserve">Concentration) </w:t>
+      </w:r>
+      <w:r>
+        <w:t>—</w:t>
+      </w:r>
+      <w:proofErr w:type="gramEnd"/>
+      <w:r>
+        <w:t xml:space="preserve"> New York University, 2022</w:t>
       </w:r>
     </w:p>
     <w:p>
       <w:pPr>
         <w:spacing w:after="80"/>
-        <w:jc w:val="center"/>
       </w:pPr>
       <w:r>
         <w:rPr>
@@ -95,13 +159,7 @@
         <w:rPr>
           <w:b/>
         </w:rPr>
-        <w:t>B</w:t>
-      </w:r>
-      <w:r>
-        <w:rPr>
-          <w:b/>
-        </w:rPr>
-        <w:t>usiness minor</w:t>
+        <w:t>Minor in Business</w:t>
       </w:r>
       <w:r>
         <w:t xml:space="preserve"> — University of Wisconsin-Madison, 2014</w:t>
@@ -166,7 +224,64 @@
           <w:b/>
           <w:sz w:val="26"/>
         </w:rPr>
-        <w:t>CREATIVE WORK &amp; RESEARCH: THE COMPOSER HUB</w:t>
+        <w:t xml:space="preserve">CREATIVE WORK &amp; RESEARCH: </w:t>
+      </w:r>
+      <w:hyperlink r:id="rId8" w:history="1">
+        <w:r>
+          <w:rPr>
+            <w:rStyle w:val="Hyperlink"/>
+            <w:b/>
+            <w:sz w:val="26"/>
+          </w:rPr>
+          <w:t>THE COMPOSER HUB</w:t>
+        </w:r>
+      </w:hyperlink>
+    </w:p>
+    <w:p>
+      <w:pPr>
+        <w:spacing w:before="160" w:after="40"/>
+        <w:rPr>
+          <w:bCs/>
+          <w:i/>
+          <w:iCs/>
+          <w:sz w:val="23"/>
+        </w:rPr>
+      </w:pPr>
+      <w:r>
+        <w:rPr>
+          <w:bCs/>
+          <w:i/>
+          <w:iCs/>
+          <w:sz w:val="23"/>
+        </w:rPr>
+        <w:t>Current AI music tools are built to generate music, offering nothing to a musician who already knows how to write</w:t>
+      </w:r>
+      <w:r>
+        <w:rPr>
+          <w:bCs/>
+          <w:i/>
+          <w:iCs/>
+          <w:sz w:val="23"/>
+        </w:rPr>
+        <w:t xml:space="preserve"> and make</w:t>
+      </w:r>
+      <w:r>
+        <w:rPr>
+          <w:bCs/>
+          <w:i/>
+          <w:iCs/>
+          <w:sz w:val="23"/>
+        </w:rPr>
+        <w:t xml:space="preserve"> it. The Composer Hub is built to prove AI can assist trained musicians in their creative process, career, and workflow, without diluting human creation.</w:t>
+      </w:r>
+      <w:r>
+        <w:rPr>
+          <w:bCs/>
+          <w:i/>
+          <w:iCs/>
+          <w:sz w:val="23"/>
+        </w:rPr>
+        <w:t xml:space="preserve"> </w:t>
       </w:r>
     </w:p>
     <w:p>
@@ -207,7 +322,15 @@
         <w:spacing w:after="40"/>
       </w:pPr>
       <w:r>
-        <w:t>Grounds every evaluation in the composer's own reference material, not generic AI assumptions, via a searchable personal music theory library (ChromaDB, sentence-transformer embeddings).</w:t>
+        <w:t>Grounds every evaluation in the composer's own reference material, not generic AI assumptions, via a searchable personal music theory library (</w:t>
+      </w:r>
+      <w:proofErr w:type="spellStart"/>
+      <w:r>
+        <w:t>ChromaDB</w:t>
+      </w:r>
+      <w:proofErr w:type="spellEnd"/>
+      <w:r>
+        <w:t>).</w:t>
       </w:r>
     </w:p>
     <w:p>
@@ -216,7 +339,34 @@
         <w:spacing w:after="40"/>
       </w:pPr>
       <w:r>
-        <w:t>Guides the composer through the actual creative workflow in a Next.js interface built on the Anthropic API: planning, rough draft, detailed draft, and engraving.</w:t>
+        <w:t>Allows</w:t>
+      </w:r>
+      <w:r>
+        <w:t xml:space="preserve"> the composer t</w:t>
+      </w:r>
+      <w:r>
+        <w:t>o</w:t>
+      </w:r>
+      <w:r>
+        <w:t xml:space="preserve"> </w:t>
+      </w:r>
+      <w:r>
+        <w:t>visualize their</w:t>
+      </w:r>
+      <w:r>
+        <w:t xml:space="preserve"> creative workflow in a Next.js interface built on the Anthropic API: planning, </w:t>
+      </w:r>
+      <w:r>
+        <w:t>sketching, analyzing</w:t>
+      </w:r>
+      <w:r>
+        <w:t xml:space="preserve">, </w:t>
+      </w:r>
+      <w:r>
+        <w:t>draft management</w:t>
+      </w:r>
+      <w:r>
+        <w:t>, and engraving.</w:t>
       </w:r>
     </w:p>
     <w:p>
@@ -225,7 +375,16 @@
         <w:spacing w:after="40"/>
       </w:pPr>
       <w:r>
-        <w:t>Tested the trained agent across several AI models to compare how reliably each one captures and reinforces an individual compositional process, rather than defaulting to its own.</w:t>
+        <w:t xml:space="preserve">Tested the trained agent across several AI models to compare </w:t>
+      </w:r>
+      <w:r>
+        <w:t>the utility of each response</w:t>
+      </w:r>
+      <w:r>
+        <w:t xml:space="preserve"> using a multi-dimension, weighted rubric</w:t>
+      </w:r>
+      <w:r>
+        <w:t>.</w:t>
       </w:r>
     </w:p>
     <w:p>
@@ -254,8 +413,31 @@
           <w:i/>
           <w:iCs/>
         </w:rPr>
-        <w:t>A working tool for running a composing and performing practice, live and used daily: the career-development piece, since a composer's career is also a small business that needs one place to run from instead of scattered email and spreadsheets.</w:t>
-      </w:r>
+        <w:t xml:space="preserve">A tool </w:t>
+      </w:r>
+      <w:r>
+        <w:rPr>
+          <w:i/>
+          <w:iCs/>
+        </w:rPr>
+        <w:t>to organize and manage the</w:t>
+      </w:r>
+      <w:r>
+        <w:rPr>
+          <w:i/>
+          <w:iCs/>
+        </w:rPr>
+        <w:t xml:space="preserve"> career side to being a </w:t>
+      </w:r>
+      <w:proofErr w:type="gramStart"/>
+      <w:r>
+        <w:rPr>
+          <w:i/>
+          <w:iCs/>
+        </w:rPr>
+        <w:t>compose</w:t>
+      </w:r>
+      <w:proofErr w:type="gramEnd"/>
     </w:p>
     <w:p>
       <w:pPr>
@@ -263,7 +445,31 @@
         <w:spacing w:after="40"/>
       </w:pPr>
       <w:r>
-        <w:t>Tracks contacts, organizations, and concerts (budgets, communications, media), plus newsletters, outreach, and prospects.</w:t>
+        <w:t xml:space="preserve">Tracks </w:t>
+      </w:r>
+      <w:r>
+        <w:t>performers</w:t>
+      </w:r>
+      <w:r>
+        <w:t xml:space="preserve">, </w:t>
+      </w:r>
+      <w:r>
+        <w:t xml:space="preserve">prospects, </w:t>
+      </w:r>
+      <w:r>
+        <w:t>ensembles</w:t>
+      </w:r>
+      <w:r>
+        <w:t>,</w:t>
+      </w:r>
+      <w:r>
+        <w:t xml:space="preserve"> venues,</w:t>
+      </w:r>
+      <w:r>
+        <w:t xml:space="preserve"> and concerts (budgets, communications, media)</w:t>
+      </w:r>
+      <w:r>
+        <w:t>.</w:t>
       </w:r>
     </w:p>
     <w:p>
@@ -272,7 +478,25 @@
         <w:spacing w:after="40"/>
       </w:pPr>
       <w:r>
-        <w:t>Includes one AI feature already: a newsletter-polishing step, extended further in Virtual Agency.</w:t>
+        <w:t xml:space="preserve">A </w:t>
+      </w:r>
+      <w:r>
+        <w:t>newsletter builder tool</w:t>
+      </w:r>
+    </w:p>
+    <w:p>
+      <w:pPr>
+        <w:pStyle w:val="ListBullet"/>
+        <w:spacing w:after="40"/>
+      </w:pPr>
+      <w:r>
+        <w:t xml:space="preserve">An AI outreach feature to </w:t>
+      </w:r>
+      <w:r>
+        <w:t>research and compile</w:t>
+      </w:r>
+      <w:r>
+        <w:t xml:space="preserve"> new prospects</w:t>
       </w:r>
     </w:p>
     <w:p>
@@ -301,7 +525,14 @@
           <w:i/>
           <w:iCs/>
         </w:rPr>
-        <w:t>A set of AI agents that run the supporting work of the same practice, marketing, web design, social media, relationship management: the efficient-workflow piece, testing AI on the actual work of running a music career rather than composition itself.</w:t>
+        <w:t>A virtual label/publisher: customizable AI employees that fill the roles a record label or publisher normally provides, still in training and under close human oversight.</w:t>
+      </w:r>
+      <w:r>
+        <w:rPr>
+          <w:i/>
+          <w:iCs/>
+        </w:rPr>
+        <w:t xml:space="preserve"> </w:t>
       </w:r>
     </w:p>
     <w:p>
@@ -310,15 +541,26 @@
         <w:spacing w:after="40"/>
       </w:pPr>
       <w:r>
-        <w:t xml:space="preserve">Each agent </w:t>
-      </w:r>
-      <w:proofErr w:type="gramStart"/>
-      <w:r>
-        <w:t>is</w:t>
-      </w:r>
-      <w:proofErr w:type="gramEnd"/>
-      <w:r>
-        <w:t xml:space="preserve"> a job description (a system prompt) plus a set of tools, run from the command line, on a schedule, or as a sub-task.</w:t>
+        <w:lastRenderedPageBreak/>
+        <w:t xml:space="preserve">Each agent is a </w:t>
+      </w:r>
+      <w:r>
+        <w:t xml:space="preserve">system prompt </w:t>
+      </w:r>
+      <w:r>
+        <w:t>(</w:t>
+      </w:r>
+      <w:r>
+        <w:t>job description</w:t>
+      </w:r>
+      <w:r>
+        <w:t>) plus a set of tools</w:t>
+      </w:r>
+      <w:r>
+        <w:t>/skills</w:t>
+      </w:r>
+      <w:r>
+        <w:t xml:space="preserve"> </w:t>
       </w:r>
     </w:p>
     <w:p>
@@ -327,8 +569,27 @@
         <w:spacing w:after="40"/>
       </w:pPr>
       <w:r>
-        <w:lastRenderedPageBreak/>
-        <w:t>Built three so far, Marketing, Web Design, and Social Media, each shipping real work: a concert landing page, an 11-person outreach campaign, a two-week content calendar.</w:t>
+        <w:t>Can run on a schedule or be triggered manually.</w:t>
+      </w:r>
+    </w:p>
+    <w:p>
+      <w:pPr>
+        <w:pStyle w:val="ListBullet"/>
+        <w:spacing w:after="40"/>
+      </w:pPr>
+      <w:r>
+        <w:t xml:space="preserve">Marketing, Web Design, and </w:t>
+      </w:r>
+      <w:proofErr w:type="gramStart"/>
+      <w:r>
+        <w:t>Social Media</w:t>
+      </w:r>
+      <w:proofErr w:type="gramEnd"/>
+      <w:r>
+        <w:t xml:space="preserve"> virtual employees</w:t>
+      </w:r>
+      <w:r>
+        <w:t xml:space="preserve"> have produced a concert landing page and digital program notes, an outreach campaign, and a content calendar.</w:t>
       </w:r>
     </w:p>
     <w:p>
@@ -350,12 +611,36 @@
       <w:pPr>
         <w:spacing w:before="160" w:after="40"/>
       </w:pPr>
+      <w:hyperlink r:id="rId9" w:history="1">
+        <w:r>
+          <w:rPr>
+            <w:rStyle w:val="Hyperlink"/>
+            <w:b/>
+            <w:sz w:val="23"/>
+          </w:rPr>
+          <w:t>The Sprout Suite</w:t>
+        </w:r>
+      </w:hyperlink>
       <w:r>
         <w:rPr>
           <w:b/>
           <w:sz w:val="23"/>
         </w:rPr>
-        <w:t>The Sprout Suite (2024-present)</w:t>
+        <w:t xml:space="preserve"> (202</w:t>
+      </w:r>
+      <w:r>
+        <w:rPr>
+          <w:b/>
+          <w:sz w:val="23"/>
+        </w:rPr>
+        <w:t>5</w:t>
+      </w:r>
+      <w:r>
+        <w:rPr>
+          <w:b/>
+          <w:sz w:val="23"/>
+        </w:rPr>
+        <w:t>-present)</w:t>
       </w:r>
     </w:p>
     <w:p>
@@ -388,7 +673,7 @@
           <w:i/>
           <w:iCs/>
         </w:rPr>
-        <w:t xml:space="preserve"> for Sprout Society, a Brooklyn community space for creatives, all on one Supabase backend: a CRM, </w:t>
+        <w:t xml:space="preserve"> for Sprout Society, a Brooklyn community space for creatives: a CRM, </w:t>
       </w:r>
       <w:proofErr w:type="gramStart"/>
       <w:r>
@@ -404,23 +689,7 @@
           <w:i/>
           <w:iCs/>
         </w:rPr>
-        <w:t xml:space="preserve"> and writing assistant, a social media manager, and a campaign tracker. The same </w:t>
-      </w:r>
-      <w:proofErr w:type="gramStart"/>
-      <w:r>
-        <w:rPr>
-          <w:i/>
-          <w:iCs/>
-        </w:rPr>
-        <w:t>systems</w:t>
-      </w:r>
-      <w:proofErr w:type="gramEnd"/>
-      <w:r>
-        <w:rPr>
-          <w:i/>
-          <w:iCs/>
-        </w:rPr>
-        <w:t>-building outside music, four tools, one person, in daily production use.</w:t>
+        <w:t xml:space="preserve"> and writing assistant, a social media manager, and a campaign tracker.</w:t>
       </w:r>
     </w:p>
     <w:p>
@@ -429,7 +698,19 @@
         <w:spacing w:after="40"/>
       </w:pPr>
       <w:r>
-        <w:t>Designed and built all four, self-taught. All four are used daily, not prototypes.</w:t>
+        <w:t xml:space="preserve">CRM: a </w:t>
+      </w:r>
+      <w:r>
+        <w:t>tool</w:t>
+      </w:r>
+      <w:r>
+        <w:t xml:space="preserve"> to manage contacts</w:t>
+      </w:r>
+      <w:r>
+        <w:t>, donors, outreach, and events management</w:t>
+      </w:r>
+      <w:r>
+        <w:t>.</w:t>
       </w:r>
     </w:p>
     <w:p>
@@ -438,7 +719,55 @@
         <w:spacing w:after="40"/>
       </w:pPr>
       <w:r>
-        <w:t>Verifiable on the AI portfolio: https://ai-portfolio-landing-page.vercel.app/</w:t>
+        <w:t>Grant Tool: AI assisted grant research and compatibility</w:t>
+      </w:r>
+      <w:r>
+        <w:t>, with grant life cycle tracking, and application workspace</w:t>
+      </w:r>
+      <w:r>
+        <w:t>.</w:t>
+      </w:r>
+    </w:p>
+    <w:p>
+      <w:pPr>
+        <w:pStyle w:val="ListBullet"/>
+        <w:spacing w:after="40"/>
+      </w:pPr>
+      <w:r>
+        <w:t>Social Media Manager: a repository and workspace for social media conten</w:t>
+      </w:r>
+      <w:r>
+        <w:t>t, with automated publishing feature that runs on a content calendar</w:t>
+      </w:r>
+      <w:r>
+        <w:t>.</w:t>
+      </w:r>
+    </w:p>
+    <w:p>
+      <w:pPr>
+        <w:pStyle w:val="ListBullet"/>
+        <w:spacing w:after="40"/>
+      </w:pPr>
+      <w:r>
+        <w:t>Campaign</w:t>
+      </w:r>
+      <w:r>
+        <w:t xml:space="preserve"> Tracker: </w:t>
+      </w:r>
+      <w:r>
+        <w:t xml:space="preserve">A </w:t>
+      </w:r>
+      <w:r>
+        <w:t>dynamic</w:t>
+      </w:r>
+      <w:r>
+        <w:t xml:space="preserve"> QR code builder that tracks scans </w:t>
+      </w:r>
+      <w:r>
+        <w:t>and visualizes data</w:t>
+      </w:r>
+      <w:r>
+        <w:t>.</w:t>
       </w:r>
     </w:p>
     <w:p>
@@ -516,10 +845,17 @@
     <w:p>
       <w:pPr>
         <w:pStyle w:val="ListBullet"/>
-        <w:spacing w:after="40"/>
-      </w:pPr>
-      <w:r>
-        <w:t>Prompt engineering and data annotation supporting large language model evaluation.</w:t>
+      </w:pPr>
+      <w:r>
+        <w:t>Annotate and evaluate AI-generated music.</w:t>
+      </w:r>
+    </w:p>
+    <w:p>
+      <w:pPr>
+        <w:pStyle w:val="ListBullet"/>
+      </w:pPr>
+      <w:r>
+        <w:t>Write prompts and rubrics to evaluate AI responses on musical analysis, not generation: identify failures and document the correct answer.</w:t>
       </w:r>
     </w:p>
     <w:p>
@@ -562,7 +898,19 @@
         <w:spacing w:after="40"/>
       </w:pPr>
       <w:r>
-        <w:t>Owned strategy, product, marketing, and finances. Talked to users, iterated the model, then decided to shut it down.</w:t>
+        <w:t xml:space="preserve">Owned strategy, product, marketing, and finances. </w:t>
+      </w:r>
+      <w:r>
+        <w:t xml:space="preserve">Began market </w:t>
+      </w:r>
+      <w:r>
+        <w:t>testing</w:t>
+      </w:r>
+      <w:r>
+        <w:t xml:space="preserve">, iterated the model, then decided to </w:t>
+      </w:r>
+      <w:r>
+        <w:t xml:space="preserve">place the project on hold. </w:t>
       </w:r>
     </w:p>
     <w:p>
@@ -610,76 +958,105 @@
     </w:p>
     <w:p>
       <w:pPr>
-        <w:pBdr>
-          <w:bottom w:val="single" w:sz="6" w:space="2" w:color="444444"/>
-        </w:pBdr>
-        <w:spacing w:before="280" w:after="80"/>
-      </w:pPr>
-      <w:r>
-        <w:rPr>
-          <w:b/>
-          <w:sz w:val="26"/>
-        </w:rPr>
-        <w:t>TECHNICAL SKILLS</w:t>
-      </w:r>
+        <w:pStyle w:val="ListBullet"/>
+        <w:numPr>
+          <w:ilvl w:val="0"/>
+          <w:numId w:val="0"/>
+        </w:numPr>
+        <w:spacing w:after="40"/>
+        <w:ind w:left="360" w:hanging="360"/>
+      </w:pPr>
     </w:p>
     <w:p>
       <w:pPr>
         <w:spacing w:after="80"/>
-        <w:jc w:val="both"/>
       </w:pPr>
       <w:r>
         <w:rPr>
           <w:b/>
         </w:rPr>
-        <w:t>AI/ML systems:</w:t>
-      </w:r>
-      <w:r>
-        <w:t xml:space="preserve"> Claude/Anthropic API (direct SDK integration), Model Context Protocol (agent tool and resource design), retrieval-augmented generation (ChromaDB, sentence-transformer embeddings), agent evaluation and rubric design for generative creative output</w:t>
-      </w:r>
-    </w:p>
-    <w:p>
-      <w:pPr>
-        <w:spacing w:after="80"/>
-        <w:jc w:val="both"/>
-      </w:pPr>
+        <w:t>Composer</w:t>
+      </w:r>
       <w:r>
         <w:rPr>
           <w:b/>
         </w:rPr>
-        <w:t>Development:</w:t>
-      </w:r>
-      <w:r>
-        <w:t xml:space="preserve"> Next.js, React, </w:t>
-      </w:r>
-      <w:proofErr w:type="spellStart"/>
-      <w:r>
-        <w:t>Supabase</w:t>
-      </w:r>
-      <w:proofErr w:type="spellEnd"/>
-      <w:r>
-        <w:t>, JavaScript/TypeScript,</w:t>
-      </w:r>
-      <w:r>
-        <w:t xml:space="preserve"> Python,</w:t>
-      </w:r>
-      <w:r>
-        <w:t xml:space="preserve"> RESTful APIs</w:t>
-      </w:r>
-    </w:p>
-    <w:p>
-      <w:pPr>
-        <w:spacing w:after="80"/>
-        <w:jc w:val="both"/>
-      </w:pPr>
+        <w:t xml:space="preserve"> and Songwriter</w:t>
+      </w:r>
       <w:r>
         <w:rPr>
           <w:b/>
         </w:rPr>
-        <w:t>Prompt architecture:</w:t>
-      </w:r>
-      <w:r>
-        <w:t xml:space="preserve"> structured, multi-phase research and evaluation protocols that produce schema-validated output</w:t>
+        <w:t xml:space="preserve"> — Independent</w:t>
+      </w:r>
+      <w:r>
+        <w:t xml:space="preserve"> | 2</w:t>
+      </w:r>
+      <w:r>
+        <w:t>014</w:t>
+      </w:r>
+      <w:r>
+        <w:t>-Present</w:t>
+      </w:r>
+    </w:p>
+    <w:p>
+      <w:pPr>
+        <w:pStyle w:val="ListBullet"/>
+        <w:spacing w:after="40"/>
+      </w:pPr>
+      <w:hyperlink r:id="rId10" w:history="1">
+        <w:r>
+          <w:rPr>
+            <w:rStyle w:val="Hyperlink"/>
+          </w:rPr>
+          <w:t xml:space="preserve">Both in pop/contemporary and </w:t>
+        </w:r>
+        <w:r>
+          <w:rPr>
+            <w:rStyle w:val="Hyperlink"/>
+          </w:rPr>
+          <w:t>concert music styles</w:t>
+        </w:r>
+      </w:hyperlink>
+    </w:p>
+    <w:p>
+      <w:pPr>
+        <w:pStyle w:val="ListBullet"/>
+        <w:spacing w:after="40"/>
+      </w:pPr>
+      <w:r>
+        <w:t>Songwriting and producer credits</w:t>
+      </w:r>
+      <w:r>
+        <w:t xml:space="preserve"> for pop and rock (John Harvie, Brett Altman)</w:t>
+      </w:r>
+    </w:p>
+    <w:p>
+      <w:pPr>
+        <w:pStyle w:val="ListBullet"/>
+        <w:spacing w:after="40"/>
+      </w:pPr>
+      <w:r>
+        <w:t>A recent return to concert mu</w:t>
+      </w:r>
+      <w:r>
+        <w:t xml:space="preserve">sic and re-debut concert </w:t>
+      </w:r>
+      <w:r>
+        <w:t>in June 2026 in NYC</w:t>
+      </w:r>
+    </w:p>
+    <w:p>
+      <w:pPr>
+        <w:pStyle w:val="ListBullet"/>
+        <w:spacing w:after="40"/>
+      </w:pPr>
+      <w:r>
+        <w:lastRenderedPageBreak/>
+        <w:t>Produce and host a concert music series</w:t>
+      </w:r>
+      <w:r>
+        <w:t xml:space="preserve"> for composers and performers in NYC </w:t>
       </w:r>
     </w:p>
     <w:sectPr>
@@ -847,7 +1224,7 @@
   <w:abstractNum w:abstractNumId="8" w15:restartNumberingAfterBreak="0">
     <w:nsid w:val="FFFFFF89"/>
     <w:multiLevelType w:val="singleLevel"/>
-    <w:tmpl w:val="29761A62"/>
+    <w:tmpl w:val="5C8A8BF8"/>
     <w:lvl w:ilvl="0">
       <w:start w:val="1"/>
       <w:numFmt w:val="bullet"/>
@@ -862,6 +1239,304 @@
       </w:pPr>
       <w:rPr>
         <w:rFonts w:ascii="Symbol" w:hAnsi="Symbol" w:hint="default"/>
+      </w:rPr>
+    </w:lvl>
+  </w:abstractNum>
+  <w:abstractNum w:abstractNumId="9" w15:restartNumberingAfterBreak="0">
+    <w:nsid w:val="3254768F"/>
+    <w:multiLevelType w:val="multilevel"/>
+    <w:tmpl w:val="3B3CB836"/>
+    <w:lvl w:ilvl="0">
+      <w:start w:val="1"/>
+      <w:numFmt w:val="bullet"/>
+      <w:lvlText w:val=""/>
+      <w:lvlJc w:val="left"/>
+      <w:pPr>
+        <w:tabs>
+          <w:tab w:val="num" w:pos="720"/>
+        </w:tabs>
+        <w:ind w:left="720" w:hanging="360"/>
+      </w:pPr>
+      <w:rPr>
+        <w:rFonts w:ascii="Symbol" w:hAnsi="Symbol" w:hint="default"/>
+        <w:sz w:val="20"/>
+      </w:rPr>
+    </w:lvl>
+    <w:lvl w:ilvl="1" w:tentative="1">
+      <w:start w:val="1"/>
+      <w:numFmt w:val="bullet"/>
+      <w:lvlText w:val="o"/>
+      <w:lvlJc w:val="left"/>
+      <w:pPr>
+        <w:tabs>
+          <w:tab w:val="num" w:pos="1440"/>
+        </w:tabs>
+        <w:ind w:left="1440" w:hanging="360"/>
+      </w:pPr>
+      <w:rPr>
+        <w:rFonts w:ascii="Courier New" w:hAnsi="Courier New" w:hint="default"/>
+        <w:sz w:val="20"/>
+      </w:rPr>
+    </w:lvl>
+    <w:lvl w:ilvl="2" w:tentative="1">
+      <w:start w:val="1"/>
+      <w:numFmt w:val="bullet"/>
+      <w:lvlText w:val=""/>
+      <w:lvlJc w:val="left"/>
+      <w:pPr>
+        <w:tabs>
+          <w:tab w:val="num" w:pos="2160"/>
+        </w:tabs>
+        <w:ind w:left="2160" w:hanging="360"/>
+      </w:pPr>
+      <w:rPr>
+        <w:rFonts w:ascii="Wingdings" w:hAnsi="Wingdings" w:hint="default"/>
+        <w:sz w:val="20"/>
+      </w:rPr>
+    </w:lvl>
+    <w:lvl w:ilvl="3" w:tentative="1">
+      <w:start w:val="1"/>
+      <w:numFmt w:val="bullet"/>
+      <w:lvlText w:val=""/>
+      <w:lvlJc w:val="left"/>
+      <w:pPr>
+        <w:tabs>
+          <w:tab w:val="num" w:pos="2880"/>
+        </w:tabs>
+        <w:ind w:left="2880" w:hanging="360"/>
+      </w:pPr>
+      <w:rPr>
+        <w:rFonts w:ascii="Wingdings" w:hAnsi="Wingdings" w:hint="default"/>
+        <w:sz w:val="20"/>
+      </w:rPr>
+    </w:lvl>
+    <w:lvl w:ilvl="4" w:tentative="1">
+      <w:start w:val="1"/>
+      <w:numFmt w:val="bullet"/>
+      <w:lvlText w:val=""/>
+      <w:lvlJc w:val="left"/>
+      <w:pPr>
+        <w:tabs>
+          <w:tab w:val="num" w:pos="3600"/>
+        </w:tabs>
+        <w:ind w:left="3600" w:hanging="360"/>
+      </w:pPr>
+      <w:rPr>
+        <w:rFonts w:ascii="Wingdings" w:hAnsi="Wingdings" w:hint="default"/>
+        <w:sz w:val="20"/>
+      </w:rPr>
+    </w:lvl>
+    <w:lvl w:ilvl="5" w:tentative="1">
+      <w:start w:val="1"/>
+      <w:numFmt w:val="bullet"/>
+      <w:lvlText w:val=""/>
+      <w:lvlJc w:val="left"/>
+      <w:pPr>
+        <w:tabs>
+          <w:tab w:val="num" w:pos="4320"/>
+        </w:tabs>
+        <w:ind w:left="4320" w:hanging="360"/>
+      </w:pPr>
+      <w:rPr>
+        <w:rFonts w:ascii="Wingdings" w:hAnsi="Wingdings" w:hint="default"/>
+        <w:sz w:val="20"/>
+      </w:rPr>
+    </w:lvl>
+    <w:lvl w:ilvl="6" w:tentative="1">
+      <w:start w:val="1"/>
+      <w:numFmt w:val="bullet"/>
+      <w:lvlText w:val=""/>
+      <w:lvlJc w:val="left"/>
+      <w:pPr>
+        <w:tabs>
+          <w:tab w:val="num" w:pos="5040"/>
+        </w:tabs>
+        <w:ind w:left="5040" w:hanging="360"/>
+      </w:pPr>
+      <w:rPr>
+        <w:rFonts w:ascii="Wingdings" w:hAnsi="Wingdings" w:hint="default"/>
+        <w:sz w:val="20"/>
+      </w:rPr>
+    </w:lvl>
+    <w:lvl w:ilvl="7" w:tentative="1">
+      <w:start w:val="1"/>
+      <w:numFmt w:val="bullet"/>
+      <w:lvlText w:val=""/>
+      <w:lvlJc w:val="left"/>
+      <w:pPr>
+        <w:tabs>
+          <w:tab w:val="num" w:pos="5760"/>
+        </w:tabs>
+        <w:ind w:left="5760" w:hanging="360"/>
+      </w:pPr>
+      <w:rPr>
+        <w:rFonts w:ascii="Wingdings" w:hAnsi="Wingdings" w:hint="default"/>
+        <w:sz w:val="20"/>
+      </w:rPr>
+    </w:lvl>
+    <w:lvl w:ilvl="8" w:tentative="1">
+      <w:start w:val="1"/>
+      <w:numFmt w:val="bullet"/>
+      <w:lvlText w:val=""/>
+      <w:lvlJc w:val="left"/>
+      <w:pPr>
+        <w:tabs>
+          <w:tab w:val="num" w:pos="6480"/>
+        </w:tabs>
+        <w:ind w:left="6480" w:hanging="360"/>
+      </w:pPr>
+      <w:rPr>
+        <w:rFonts w:ascii="Wingdings" w:hAnsi="Wingdings" w:hint="default"/>
+        <w:sz w:val="20"/>
+      </w:rPr>
+    </w:lvl>
+  </w:abstractNum>
+  <w:abstractNum w:abstractNumId="10" w15:restartNumberingAfterBreak="0">
+    <w:nsid w:val="3AAF17DF"/>
+    <w:multiLevelType w:val="multilevel"/>
+    <w:tmpl w:val="121E4D9C"/>
+    <w:lvl w:ilvl="0">
+      <w:start w:val="1"/>
+      <w:numFmt w:val="bullet"/>
+      <w:lvlText w:val=""/>
+      <w:lvlJc w:val="left"/>
+      <w:pPr>
+        <w:tabs>
+          <w:tab w:val="num" w:pos="720"/>
+        </w:tabs>
+        <w:ind w:left="720" w:hanging="360"/>
+      </w:pPr>
+      <w:rPr>
+        <w:rFonts w:ascii="Symbol" w:hAnsi="Symbol" w:hint="default"/>
+        <w:sz w:val="20"/>
+      </w:rPr>
+    </w:lvl>
+    <w:lvl w:ilvl="1" w:tentative="1">
+      <w:start w:val="1"/>
+      <w:numFmt w:val="bullet"/>
+      <w:lvlText w:val="o"/>
+      <w:lvlJc w:val="left"/>
+      <w:pPr>
+        <w:tabs>
+          <w:tab w:val="num" w:pos="1440"/>
+        </w:tabs>
+        <w:ind w:left="1440" w:hanging="360"/>
+      </w:pPr>
+      <w:rPr>
+        <w:rFonts w:ascii="Courier New" w:hAnsi="Courier New" w:hint="default"/>
+        <w:sz w:val="20"/>
+      </w:rPr>
+    </w:lvl>
+    <w:lvl w:ilvl="2" w:tentative="1">
+      <w:start w:val="1"/>
+      <w:numFmt w:val="bullet"/>
+      <w:lvlText w:val=""/>
+      <w:lvlJc w:val="left"/>
+      <w:pPr>
+        <w:tabs>
+          <w:tab w:val="num" w:pos="2160"/>
+        </w:tabs>
+        <w:ind w:left="2160" w:hanging="360"/>
+      </w:pPr>
+      <w:rPr>
+        <w:rFonts w:ascii="Wingdings" w:hAnsi="Wingdings" w:hint="default"/>
+        <w:sz w:val="20"/>
+      </w:rPr>
+    </w:lvl>
+    <w:lvl w:ilvl="3" w:tentative="1">
+      <w:start w:val="1"/>
+      <w:numFmt w:val="bullet"/>
+      <w:lvlText w:val=""/>
+      <w:lvlJc w:val="left"/>
+      <w:pPr>
+        <w:tabs>
+          <w:tab w:val="num" w:pos="2880"/>
+        </w:tabs>
+        <w:ind w:left="2880" w:hanging="360"/>
+      </w:pPr>
+      <w:rPr>
+        <w:rFonts w:ascii="Wingdings" w:hAnsi="Wingdings" w:hint="default"/>
+        <w:sz w:val="20"/>
+      </w:rPr>
+    </w:lvl>
+    <w:lvl w:ilvl="4" w:tentative="1">
+      <w:start w:val="1"/>
+      <w:numFmt w:val="bullet"/>
+      <w:lvlText w:val=""/>
+      <w:lvlJc w:val="left"/>
+      <w:pPr>
+        <w:tabs>
+          <w:tab w:val="num" w:pos="3600"/>
+        </w:tabs>
+        <w:ind w:left="3600" w:hanging="360"/>
+      </w:pPr>
+      <w:rPr>
+        <w:rFonts w:ascii="Wingdings" w:hAnsi="Wingdings" w:hint="default"/>
+        <w:sz w:val="20"/>
+      </w:rPr>
+    </w:lvl>
+    <w:lvl w:ilvl="5" w:tentative="1">
+      <w:start w:val="1"/>
+      <w:numFmt w:val="bullet"/>
+      <w:lvlText w:val=""/>
+      <w:lvlJc w:val="left"/>
+      <w:pPr>
+        <w:tabs>
+          <w:tab w:val="num" w:pos="4320"/>
+        </w:tabs>
+        <w:ind w:left="4320" w:hanging="360"/>
+      </w:pPr>
+      <w:rPr>
+        <w:rFonts w:ascii="Wingdings" w:hAnsi="Wingdings" w:hint="default"/>
+        <w:sz w:val="20"/>
+      </w:rPr>
+    </w:lvl>
+    <w:lvl w:ilvl="6" w:tentative="1">
+      <w:start w:val="1"/>
+      <w:numFmt w:val="bullet"/>
+      <w:lvlText w:val=""/>
+      <w:lvlJc w:val="left"/>
+      <w:pPr>
+        <w:tabs>
+          <w:tab w:val="num" w:pos="5040"/>
+        </w:tabs>
+        <w:ind w:left="5040" w:hanging="360"/>
+      </w:pPr>
+      <w:rPr>
+        <w:rFonts w:ascii="Wingdings" w:hAnsi="Wingdings" w:hint="default"/>
+        <w:sz w:val="20"/>
+      </w:rPr>
+    </w:lvl>
+    <w:lvl w:ilvl="7" w:tentative="1">
+      <w:start w:val="1"/>
+      <w:numFmt w:val="bullet"/>
+      <w:lvlText w:val=""/>
+      <w:lvlJc w:val="left"/>
+      <w:pPr>
+        <w:tabs>
+          <w:tab w:val="num" w:pos="5760"/>
+        </w:tabs>
+        <w:ind w:left="5760" w:hanging="360"/>
+      </w:pPr>
+      <w:rPr>
+        <w:rFonts w:ascii="Wingdings" w:hAnsi="Wingdings" w:hint="default"/>
+        <w:sz w:val="20"/>
+      </w:rPr>
+    </w:lvl>
+    <w:lvl w:ilvl="8" w:tentative="1">
+      <w:start w:val="1"/>
+      <w:numFmt w:val="bullet"/>
+      <w:lvlText w:val=""/>
+      <w:lvlJc w:val="left"/>
+      <w:pPr>
+        <w:tabs>
+          <w:tab w:val="num" w:pos="6480"/>
+        </w:tabs>
+        <w:ind w:left="6480" w:hanging="360"/>
+      </w:pPr>
+      <w:rPr>
+        <w:rFonts w:ascii="Wingdings" w:hAnsi="Wingdings" w:hint="default"/>
+        <w:sz w:val="20"/>
       </w:rPr>
     </w:lvl>
   </w:abstractNum>
@@ -891,6 +1566,12 @@
   </w:num>
   <w:num w:numId="9" w16cid:durableId="3946904">
     <w:abstractNumId w:val="0"/>
+  </w:num>
+  <w:num w:numId="10" w16cid:durableId="1491212034">
+    <w:abstractNumId w:val="10"/>
+  </w:num>
+  <w:num w:numId="11" w16cid:durableId="1372993307">
+    <w:abstractNumId w:val="9"/>
   </w:num>
 </w:numbering>
 </file>
@@ -1284,7 +1965,7 @@
   <w:style w:type="paragraph" w:default="1" w:styleId="Normal">
     <w:name w:val="Normal"/>
     <w:qFormat/>
-    <w:rsid w:val="00FC693F"/>
+    <w:rsid w:val="002114E4"/>
     <w:pPr>
       <w:spacing w:after="0"/>
     </w:pPr>
@@ -12280,6 +12961,41 @@
         <w:shd w:val="clear" w:color="auto" w:fill="FBCAA2" w:themeFill="accent6" w:themeFillTint="7F"/>
       </w:tcPr>
     </w:tblStylePr>
+  </w:style>
+  <w:style w:type="character" w:styleId="Hyperlink">
+    <w:name w:val="Hyperlink"/>
+    <w:basedOn w:val="DefaultParagraphFont"/>
+    <w:uiPriority w:val="99"/>
+    <w:unhideWhenUsed/>
+    <w:rsid w:val="00A675D2"/>
+    <w:rPr>
+      <w:color w:val="0000FF" w:themeColor="hyperlink"/>
+      <w:u w:val="single"/>
+    </w:rPr>
+  </w:style>
+  <w:style w:type="character" w:styleId="UnresolvedMention">
+    <w:name w:val="Unresolved Mention"/>
+    <w:basedOn w:val="DefaultParagraphFont"/>
+    <w:uiPriority w:val="99"/>
+    <w:semiHidden/>
+    <w:unhideWhenUsed/>
+    <w:rsid w:val="00A675D2"/>
+    <w:rPr>
+      <w:color w:val="605E5C"/>
+      <w:shd w:val="clear" w:color="auto" w:fill="E1DFDD"/>
+    </w:rPr>
+  </w:style>
+  <w:style w:type="character" w:styleId="FollowedHyperlink">
+    <w:name w:val="FollowedHyperlink"/>
+    <w:basedOn w:val="DefaultParagraphFont"/>
+    <w:uiPriority w:val="99"/>
+    <w:semiHidden/>
+    <w:unhideWhenUsed/>
+    <w:rsid w:val="00A675D2"/>
+    <w:rPr>
+      <w:color w:val="800080" w:themeColor="followedHyperlink"/>
+      <w:u w:val="single"/>
+    </w:rPr>
   </w:style>
 </w:styles>
 </file>

</xml_diff>